<commit_message>
add a new feature concept
</commit_message>
<xml_diff>
--- a/Documentation/Analysis/Future Enhancements/System feature ideas - W.docx
+++ b/Documentation/Analysis/Future Enhancements/System feature ideas - W.docx
@@ -916,6 +916,147 @@
             <w:vAlign w:val="top"/>
           </w:tcPr>
           <w:p/>
+        </w:tc>
+      </w:tr>
+      <w:tr>
+        <w:tblPrEx>
+          <w:shd w:val="clear" w:color="auto" w:fill="auto"/>
+        </w:tblPrEx>
+        <w:trPr>
+          <w:trHeight w:val="553" w:hRule="atLeast"/>
+        </w:trPr>
+        <w:tc>
+          <w:tcPr>
+            <w:tcW w:type="dxa" w:w="1204"/>
+            <w:tcBorders>
+              <w:top w:val="single" w:color="929292" w:sz="4" w:space="0" w:shadow="0" w:frame="0"/>
+              <w:left w:val="single" w:color="929292" w:sz="4" w:space="0" w:shadow="0" w:frame="0"/>
+              <w:bottom w:val="single" w:color="929292" w:sz="4" w:space="0" w:shadow="0" w:frame="0"/>
+              <w:right w:val="single" w:color="89847f" w:sz="8" w:space="0" w:shadow="0" w:frame="0"/>
+            </w:tcBorders>
+            <w:shd w:val="clear" w:color="auto" w:fill="auto"/>
+            <w:tcMar>
+              <w:top w:type="dxa" w:w="80"/>
+              <w:left w:type="dxa" w:w="80"/>
+              <w:bottom w:type="dxa" w:w="80"/>
+              <w:right w:type="dxa" w:w="80"/>
+            </w:tcMar>
+            <w:vAlign w:val="top"/>
+          </w:tcPr>
+          <w:p>
+            <w:pPr>
+              <w:pStyle w:val="Table Style 4"/>
+              <w:jc w:val="center"/>
+            </w:pPr>
+            <w:r>
+              <w:rPr>
+                <w:rFonts w:ascii="Helvetica Neue Medium" w:hAnsi="Helvetica Neue Medium"/>
+                <w:rtl w:val="0"/>
+              </w:rPr>
+              <w:t>5</w:t>
+            </w:r>
+          </w:p>
+        </w:tc>
+        <w:tc>
+          <w:tcPr>
+            <w:tcW w:type="dxa" w:w="1081"/>
+            <w:tcBorders>
+              <w:top w:val="single" w:color="929292" w:sz="4" w:space="0" w:shadow="0" w:frame="0"/>
+              <w:left w:val="single" w:color="89847f" w:sz="8" w:space="0" w:shadow="0" w:frame="0"/>
+              <w:bottom w:val="single" w:color="929292" w:sz="4" w:space="0" w:shadow="0" w:frame="0"/>
+              <w:right w:val="single" w:color="929292" w:sz="4" w:space="0" w:shadow="0" w:frame="0"/>
+            </w:tcBorders>
+            <w:shd w:val="clear" w:color="auto" w:fill="auto"/>
+            <w:tcMar>
+              <w:top w:type="dxa" w:w="80"/>
+              <w:left w:type="dxa" w:w="80"/>
+              <w:bottom w:type="dxa" w:w="80"/>
+              <w:right w:type="dxa" w:w="80"/>
+            </w:tcMar>
+            <w:vAlign w:val="top"/>
+          </w:tcPr>
+          <w:p>
+            <w:pPr>
+              <w:pStyle w:val="Table Style 2"/>
+              <w:bidi w:val="1"/>
+              <w:ind w:left="0" w:right="0" w:firstLine="0"/>
+              <w:jc w:val="left"/>
+              <w:rPr>
+                <w:rtl w:val="1"/>
+              </w:rPr>
+            </w:pPr>
+            <w:r>
+              <w:rPr>
+                <w:rFonts w:ascii="Arial Unicode MS" w:cs="Helvetica Neue" w:hAnsi="Arial Unicode MS" w:eastAsia="Arial Unicode MS" w:hint="cs"/>
+                <w:rtl w:val="1"/>
+              </w:rPr>
+              <w:t>رزرو نوبت برای دیگری</w:t>
+            </w:r>
+          </w:p>
+        </w:tc>
+        <w:tc>
+          <w:tcPr>
+            <w:tcW w:type="dxa" w:w="973"/>
+            <w:tcBorders>
+              <w:top w:val="single" w:color="929292" w:sz="4" w:space="0" w:shadow="0" w:frame="0"/>
+              <w:left w:val="single" w:color="929292" w:sz="4" w:space="0" w:shadow="0" w:frame="0"/>
+              <w:bottom w:val="single" w:color="929292" w:sz="4" w:space="0" w:shadow="0" w:frame="0"/>
+              <w:right w:val="single" w:color="929292" w:sz="4" w:space="0" w:shadow="0" w:frame="0"/>
+            </w:tcBorders>
+            <w:shd w:val="clear" w:color="auto" w:fill="auto"/>
+            <w:tcMar>
+              <w:top w:type="dxa" w:w="80"/>
+              <w:left w:type="dxa" w:w="80"/>
+              <w:bottom w:type="dxa" w:w="80"/>
+              <w:right w:type="dxa" w:w="80"/>
+            </w:tcMar>
+            <w:vAlign w:val="top"/>
+          </w:tcPr>
+          <w:p/>
+        </w:tc>
+        <w:tc>
+          <w:tcPr>
+            <w:tcW w:type="dxa" w:w="6090"/>
+            <w:tcBorders>
+              <w:top w:val="single" w:color="929292" w:sz="4" w:space="0" w:shadow="0" w:frame="0"/>
+              <w:left w:val="single" w:color="929292" w:sz="4" w:space="0" w:shadow="0" w:frame="0"/>
+              <w:bottom w:val="single" w:color="929292" w:sz="4" w:space="0" w:shadow="0" w:frame="0"/>
+              <w:right w:val="single" w:color="929292" w:sz="4" w:space="0" w:shadow="0" w:frame="0"/>
+            </w:tcBorders>
+            <w:shd w:val="clear" w:color="auto" w:fill="auto"/>
+            <w:tcMar>
+              <w:top w:type="dxa" w:w="80"/>
+              <w:left w:type="dxa" w:w="80"/>
+              <w:bottom w:type="dxa" w:w="80"/>
+              <w:right w:type="dxa" w:w="80"/>
+            </w:tcMar>
+            <w:vAlign w:val="top"/>
+          </w:tcPr>
+          <w:p>
+            <w:pPr>
+              <w:pStyle w:val="Table Style 2"/>
+              <w:bidi w:val="1"/>
+              <w:ind w:left="0" w:right="0" w:firstLine="0"/>
+              <w:jc w:val="left"/>
+              <w:rPr>
+                <w:rtl w:val="1"/>
+              </w:rPr>
+            </w:pPr>
+            <w:r>
+              <w:rPr>
+                <w:rFonts w:ascii="Arial Unicode MS" w:cs="Helvetica Neue" w:hAnsi="Arial Unicode MS" w:eastAsia="Arial Unicode MS" w:hint="cs"/>
+                <w:rtl w:val="1"/>
+              </w:rPr>
+              <w:t>کاربر بتواند در صفحه سازمان برای فرد دیگری نوبت رزرو کند و هزینه بپردازد و آن شخص خدمات دریافت کند</w:t>
+            </w:r>
+            <w:r>
+              <w:rPr>
+                <w:rFonts w:ascii="Helvetica Neue" w:hAnsi="Helvetica Neue"/>
+                <w:rtl w:val="1"/>
+              </w:rPr>
+              <w:t>.</w:t>
+            </w:r>
+          </w:p>
         </w:tc>
       </w:tr>
     </w:tbl>

</xml_diff>